<commit_message>
update view login page and view change password page
</commit_message>
<xml_diff>
--- a/Analysis/04_Activity_Diagrams.docx
+++ b/Analysis/04_Activity_Diagrams.docx
@@ -1,6 +1,6 @@
 
 <file path=word/document.xml><?xml version="1.0" encoding="utf-8"?>
-<w:document xmlns:wpc="http://schemas.microsoft.com/office/word/2010/wordprocessingCanvas" xmlns:cx="http://schemas.microsoft.com/office/drawing/2014/chartex" xmlns:mc="http://schemas.openxmlformats.org/markup-compatibility/2006" xmlns:o="urn:schemas-microsoft-com:office:office" xmlns:r="http://schemas.openxmlformats.org/officeDocument/2006/relationships" xmlns:m="http://schemas.openxmlformats.org/officeDocument/2006/math" xmlns:v="urn:schemas-microsoft-com:vml" xmlns:wp14="http://schemas.microsoft.com/office/word/2010/wordprocessingDrawing" xmlns:wp="http://schemas.openxmlformats.org/drawingml/2006/wordprocessingDrawing" xmlns:w10="urn:schemas-microsoft-com:office:word" xmlns:w="http://schemas.openxmlformats.org/wordprocessingml/2006/main" xmlns:w14="http://schemas.microsoft.com/office/word/2010/wordml" xmlns:w15="http://schemas.microsoft.com/office/word/2012/wordml" xmlns:w16se="http://schemas.microsoft.com/office/word/2015/wordml/symex" xmlns:wpg="http://schemas.microsoft.com/office/word/2010/wordprocessingGroup" xmlns:wpi="http://schemas.microsoft.com/office/word/2010/wordprocessingInk" xmlns:wne="http://schemas.microsoft.com/office/word/2006/wordml" xmlns:wps="http://schemas.microsoft.com/office/word/2010/wordprocessingShape" mc:Ignorable="w14 w15 w16se wp14">
+<w:document xmlns:wpc="http://schemas.microsoft.com/office/word/2010/wordprocessingCanvas" xmlns:cx="http://schemas.microsoft.com/office/drawing/2014/chartex" xmlns:cx1="http://schemas.microsoft.com/office/drawing/2015/9/8/chartex" xmlns:cx2="http://schemas.microsoft.com/office/drawing/2015/10/21/chartex" xmlns:cx3="http://schemas.microsoft.com/office/drawing/2016/5/9/chartex" xmlns:cx4="http://schemas.microsoft.com/office/drawing/2016/5/10/chartex" xmlns:cx5="http://schemas.microsoft.com/office/drawing/2016/5/11/chartex" xmlns:cx6="http://schemas.microsoft.com/office/drawing/2016/5/12/chartex" xmlns:cx7="http://schemas.microsoft.com/office/drawing/2016/5/13/chartex" xmlns:cx8="http://schemas.microsoft.com/office/drawing/2016/5/14/chartex" xmlns:mc="http://schemas.openxmlformats.org/markup-compatibility/2006" xmlns:aink="http://schemas.microsoft.com/office/drawing/2016/ink" xmlns:am3d="http://schemas.microsoft.com/office/drawing/2017/model3d" xmlns:o="urn:schemas-microsoft-com:office:office" xmlns:r="http://schemas.openxmlformats.org/officeDocument/2006/relationships" xmlns:m="http://schemas.openxmlformats.org/officeDocument/2006/math" xmlns:v="urn:schemas-microsoft-com:vml" xmlns:wp14="http://schemas.microsoft.com/office/word/2010/wordprocessingDrawing" xmlns:wp="http://schemas.openxmlformats.org/drawingml/2006/wordprocessingDrawing" xmlns:w10="urn:schemas-microsoft-com:office:word" xmlns:w="http://schemas.openxmlformats.org/wordprocessingml/2006/main" xmlns:w14="http://schemas.microsoft.com/office/word/2010/wordml" xmlns:w15="http://schemas.microsoft.com/office/word/2012/wordml" xmlns:w16cex="http://schemas.microsoft.com/office/word/2018/wordml/cex" xmlns:w16cid="http://schemas.microsoft.com/office/word/2016/wordml/cid" xmlns:w16="http://schemas.microsoft.com/office/word/2018/wordml" xmlns:w16sdtdh="http://schemas.microsoft.com/office/word/2020/wordml/sdtdatahash" xmlns:w16se="http://schemas.microsoft.com/office/word/2015/wordml/symex" xmlns:wpg="http://schemas.microsoft.com/office/word/2010/wordprocessingGroup" xmlns:wpi="http://schemas.microsoft.com/office/word/2010/wordprocessingInk" xmlns:wne="http://schemas.microsoft.com/office/word/2006/wordml" xmlns:wps="http://schemas.microsoft.com/office/word/2010/wordprocessingShape" mc:Ignorable="w14 w15 w16se w16cid w16 w16cex w16sdtdh wp14">
   <w:body>
     <w:p>
       <w:pPr>
@@ -28,7 +28,7 @@
             <v:path o:extrusionok="f" gradientshapeok="t" o:connecttype="rect"/>
             <o:lock v:ext="edit" aspectratio="t"/>
           </v:shapetype>
-          <v:shape id="_x0000_i1027" type="#_x0000_t75" style="width:272.4pt;height:612.6pt">
+          <v:shape id="_x0000_i1025" type="#_x0000_t75" style="width:272.85pt;height:612.65pt">
             <v:imagedata r:id="rId6" o:title="Edit_transaction_2"/>
           </v:shape>
         </w:pict>
@@ -41,12 +41,21 @@
           <w:rtl/>
         </w:rPr>
       </w:pPr>
-      <w:r>
-        <w:rPr>
-          <w:rFonts w:hint="cs"/>
-          <w:rtl/>
-        </w:rPr>
-        <w:t>طراح:علی دست رنج</w:t>
+      <w:proofErr w:type="spellStart"/>
+      <w:r>
+        <w:rPr>
+          <w:rFonts w:hint="cs"/>
+          <w:rtl/>
+        </w:rPr>
+        <w:t>طراح:علی</w:t>
+      </w:r>
+      <w:proofErr w:type="spellEnd"/>
+      <w:r>
+        <w:rPr>
+          <w:rFonts w:hint="cs"/>
+          <w:rtl/>
+        </w:rPr>
+        <w:t xml:space="preserve"> دست رنج</w:t>
       </w:r>
     </w:p>
     <w:p>
@@ -57,7 +66,6 @@
           <w:rtl/>
         </w:rPr>
       </w:pPr>
-      <w:bookmarkStart w:id="0" w:name="_GoBack"/>
       <w:r>
         <w:rPr>
           <w:noProof/>
@@ -65,12 +73,11 @@
         </w:rPr>
         <w:lastRenderedPageBreak/>
         <w:pict w14:anchorId="0D7D10A3">
-          <v:shape id="_x0000_i1030" type="#_x0000_t75" style="width:331.2pt;height:606pt">
+          <v:shape id="_x0000_i1026" type="#_x0000_t75" style="width:331.25pt;height:606.3pt">
             <v:imagedata r:id="rId7" o:title="Add_transaction_activity"/>
           </v:shape>
         </w:pict>
       </w:r>
-      <w:bookmarkEnd w:id="0"/>
     </w:p>
     <w:p>
       <w:pPr>
@@ -98,14 +105,13 @@
       <w:r>
         <w:rPr>
           <w:noProof/>
-          <w:lang w:bidi="ar-SA"/>
         </w:rPr>
         <w:lastRenderedPageBreak/>
         <w:drawing>
-          <wp:inline distT="0" distB="0" distL="0" distR="0" wp14:anchorId="759938EF" wp14:editId="13238EB2">
-            <wp:extent cx="5836285" cy="7536180"/>
-            <wp:effectExtent l="0" t="0" r="0" b="7620"/>
-            <wp:docPr id="2" name="Picture 2"/>
+          <wp:inline distT="0" distB="0" distL="0" distR="0" wp14:anchorId="3CDA7953" wp14:editId="671C4568">
+            <wp:extent cx="5840730" cy="7841673"/>
+            <wp:effectExtent l="0" t="0" r="7620" b="6985"/>
+            <wp:docPr id="1" name="Picture 1"/>
             <wp:cNvGraphicFramePr>
               <a:graphicFrameLocks xmlns:a="http://schemas.openxmlformats.org/drawingml/2006/main" noChangeAspect="1"/>
             </wp:cNvGraphicFramePr>
@@ -113,7 +119,7 @@
               <a:graphicData uri="http://schemas.openxmlformats.org/drawingml/2006/picture">
                 <pic:pic xmlns:pic="http://schemas.openxmlformats.org/drawingml/2006/picture">
                   <pic:nvPicPr>
-                    <pic:cNvPr id="0" name="Picture 2"/>
+                    <pic:cNvPr id="0" name="Picture 3"/>
                     <pic:cNvPicPr>
                       <a:picLocks noChangeAspect="1" noChangeArrowheads="1"/>
                     </pic:cNvPicPr>
@@ -134,7 +140,7 @@
                   <pic:spPr bwMode="auto">
                     <a:xfrm>
                       <a:off x="0" y="0"/>
-                      <a:ext cx="5836285" cy="7536180"/>
+                      <a:ext cx="5842787" cy="7844435"/>
                     </a:xfrm>
                     <a:prstGeom prst="rect">
                       <a:avLst/>
@@ -170,8 +176,31 @@
           <w:rFonts w:hint="cs"/>
           <w:rtl/>
         </w:rPr>
-        <w:t>طراح: علیرضا ریانی</w:t>
-      </w:r>
+        <w:t xml:space="preserve">طراح: علیرضا </w:t>
+      </w:r>
+      <w:proofErr w:type="spellStart"/>
+      <w:r>
+        <w:rPr>
+          <w:rFonts w:hint="cs"/>
+          <w:rtl/>
+        </w:rPr>
+        <w:t>ری</w:t>
+      </w:r>
+      <w:r>
+        <w:rPr>
+          <w:rFonts w:hint="cs"/>
+          <w:rtl/>
+        </w:rPr>
+        <w:t>ّ</w:t>
+      </w:r>
+      <w:r>
+        <w:rPr>
+          <w:rFonts w:hint="cs"/>
+          <w:rtl/>
+        </w:rPr>
+        <w:t>انی</w:t>
+      </w:r>
+      <w:proofErr w:type="spellEnd"/>
     </w:p>
     <w:p>
       <w:pPr>
@@ -180,24 +209,16 @@
           <w:rtl/>
         </w:rPr>
       </w:pPr>
-    </w:p>
-    <w:p>
-      <w:pPr>
-        <w:pStyle w:val="TEXT"/>
-        <w:rPr>
-          <w:rtl/>
-        </w:rPr>
-      </w:pPr>
       <w:r>
         <w:rPr>
           <w:noProof/>
-          <w:lang w:bidi="ar-SA"/>
-        </w:rPr>
+        </w:rPr>
+        <w:lastRenderedPageBreak/>
         <w:drawing>
-          <wp:inline distT="0" distB="0" distL="0" distR="0" wp14:anchorId="7197AD48" wp14:editId="40CD85BC">
-            <wp:extent cx="5566410" cy="7665720"/>
+          <wp:inline distT="0" distB="0" distL="0" distR="0" wp14:anchorId="37284E84" wp14:editId="52462B1A">
+            <wp:extent cx="5623151" cy="7800109"/>
             <wp:effectExtent l="0" t="0" r="0" b="0"/>
-            <wp:docPr id="3" name="Picture 3"/>
+            <wp:docPr id="4" name="Picture 4"/>
             <wp:cNvGraphicFramePr>
               <a:graphicFrameLocks xmlns:a="http://schemas.openxmlformats.org/drawingml/2006/main" noChangeAspect="1"/>
             </wp:cNvGraphicFramePr>
@@ -205,7 +226,7 @@
               <a:graphicData uri="http://schemas.openxmlformats.org/drawingml/2006/picture">
                 <pic:pic xmlns:pic="http://schemas.openxmlformats.org/drawingml/2006/picture">
                   <pic:nvPicPr>
-                    <pic:cNvPr id="0" name="Picture 4"/>
+                    <pic:cNvPr id="0" name="Picture 5"/>
                     <pic:cNvPicPr>
                       <a:picLocks noChangeAspect="1" noChangeArrowheads="1"/>
                     </pic:cNvPicPr>
@@ -226,7 +247,7 @@
                   <pic:spPr bwMode="auto">
                     <a:xfrm>
                       <a:off x="0" y="0"/>
-                      <a:ext cx="5566410" cy="7665720"/>
+                      <a:ext cx="5625676" cy="7803611"/>
                     </a:xfrm>
                     <a:prstGeom prst="rect">
                       <a:avLst/>
@@ -255,30 +276,46 @@
           <w:rFonts w:hint="cs"/>
           <w:rtl/>
         </w:rPr>
+        <w:t xml:space="preserve">طراح: علیرضا </w:t>
+      </w:r>
+      <w:proofErr w:type="spellStart"/>
+      <w:r>
+        <w:rPr>
+          <w:rFonts w:hint="cs"/>
+          <w:rtl/>
+        </w:rPr>
+        <w:t>ری</w:t>
+      </w:r>
+      <w:r>
+        <w:rPr>
+          <w:rFonts w:hint="cs"/>
+          <w:rtl/>
+        </w:rPr>
+        <w:t>ّ</w:t>
+      </w:r>
+      <w:r>
+        <w:rPr>
+          <w:rFonts w:hint="cs"/>
+          <w:rtl/>
+        </w:rPr>
+        <w:t>انی</w:t>
+      </w:r>
+      <w:proofErr w:type="spellEnd"/>
+    </w:p>
+    <w:p>
+      <w:pPr>
+        <w:pStyle w:val="TEXT"/>
+        <w:rPr>
+          <w:rtl/>
+        </w:rPr>
+      </w:pPr>
+      <w:r>
+        <w:rPr>
+          <w:noProof/>
+          <w:rtl/>
+          <w:lang w:bidi="ar-SA"/>
+        </w:rPr>
         <w:lastRenderedPageBreak/>
-        <w:t>طراح: علیرضا ریانی</w:t>
-      </w:r>
-      <w:r>
-        <w:rPr>
-          <w:rFonts w:hint="cs"/>
-          <w:rtl/>
-        </w:rPr>
-        <w:t>پ</w:t>
-      </w:r>
-    </w:p>
-    <w:p>
-      <w:pPr>
-        <w:pStyle w:val="TEXT"/>
-        <w:rPr>
-          <w:rtl/>
-        </w:rPr>
-      </w:pPr>
-      <w:r>
-        <w:rPr>
-          <w:noProof/>
-          <w:rtl/>
-          <w:lang w:bidi="ar-SA"/>
-        </w:rPr>
         <w:drawing>
           <wp:inline distT="0" distB="0" distL="0" distR="0" wp14:anchorId="3D73F771" wp14:editId="626E620F">
             <wp:extent cx="4823426" cy="7835236"/>
@@ -331,9 +368,17 @@
           <w:rFonts w:hint="cs"/>
           <w:rtl/>
         </w:rPr>
-        <w:lastRenderedPageBreak/>
-        <w:t>طراح: علی خواجوئی</w:t>
-      </w:r>
+        <w:t xml:space="preserve">طراح: علی </w:t>
+      </w:r>
+      <w:proofErr w:type="spellStart"/>
+      <w:r>
+        <w:rPr>
+          <w:rFonts w:hint="cs"/>
+          <w:rtl/>
+        </w:rPr>
+        <w:t>خواجوئی</w:t>
+      </w:r>
+      <w:proofErr w:type="spellEnd"/>
     </w:p>
     <w:p>
       <w:pPr>
@@ -401,9 +446,17 @@
           <w:rFonts w:hint="cs"/>
           <w:rtl/>
         </w:rPr>
-        <w:lastRenderedPageBreak/>
-        <w:t>طراح: علی خواجوئی</w:t>
-      </w:r>
+        <w:t xml:space="preserve">طراح: علی </w:t>
+      </w:r>
+      <w:proofErr w:type="spellStart"/>
+      <w:r>
+        <w:rPr>
+          <w:rFonts w:hint="cs"/>
+          <w:rtl/>
+        </w:rPr>
+        <w:t>خواجوئی</w:t>
+      </w:r>
+      <w:proofErr w:type="spellEnd"/>
     </w:p>
     <w:p>
       <w:pPr>
@@ -474,9 +527,17 @@
           <w:rFonts w:hint="cs"/>
           <w:rtl/>
         </w:rPr>
-        <w:lastRenderedPageBreak/>
-        <w:t>طراح: علی خواجوئی</w:t>
-      </w:r>
+        <w:t xml:space="preserve">طراح: علی </w:t>
+      </w:r>
+      <w:proofErr w:type="spellStart"/>
+      <w:r>
+        <w:rPr>
+          <w:rFonts w:hint="cs"/>
+          <w:rtl/>
+        </w:rPr>
+        <w:t>خواجوئی</w:t>
+      </w:r>
+      <w:proofErr w:type="spellEnd"/>
     </w:p>
     <w:sectPr>
       <w:pgSz w:w="12240" w:h="15840"/>
@@ -489,7 +550,7 @@
 </file>
 
 <file path=word/endnotes.xml><?xml version="1.0" encoding="utf-8"?>
-<w:endnotes xmlns:wpc="http://schemas.microsoft.com/office/word/2010/wordprocessingCanvas" xmlns:cx="http://schemas.microsoft.com/office/drawing/2014/chartex" xmlns:mc="http://schemas.openxmlformats.org/markup-compatibility/2006" xmlns:o="urn:schemas-microsoft-com:office:office" xmlns:r="http://schemas.openxmlformats.org/officeDocument/2006/relationships" xmlns:m="http://schemas.openxmlformats.org/officeDocument/2006/math" xmlns:v="urn:schemas-microsoft-com:vml" xmlns:wp14="http://schemas.microsoft.com/office/word/2010/wordprocessingDrawing" xmlns:wp="http://schemas.openxmlformats.org/drawingml/2006/wordprocessingDrawing" xmlns:w10="urn:schemas-microsoft-com:office:word" xmlns:w="http://schemas.openxmlformats.org/wordprocessingml/2006/main" xmlns:w14="http://schemas.microsoft.com/office/word/2010/wordml" xmlns:w15="http://schemas.microsoft.com/office/word/2012/wordml" xmlns:w16se="http://schemas.microsoft.com/office/word/2015/wordml/symex" xmlns:wpg="http://schemas.microsoft.com/office/word/2010/wordprocessingGroup" xmlns:wpi="http://schemas.microsoft.com/office/word/2010/wordprocessingInk" xmlns:wne="http://schemas.microsoft.com/office/word/2006/wordml" xmlns:wps="http://schemas.microsoft.com/office/word/2010/wordprocessingShape" mc:Ignorable="w14 w15 w16se wp14">
+<w:endnotes xmlns:wpc="http://schemas.microsoft.com/office/word/2010/wordprocessingCanvas" xmlns:cx="http://schemas.microsoft.com/office/drawing/2014/chartex" xmlns:cx1="http://schemas.microsoft.com/office/drawing/2015/9/8/chartex" xmlns:cx2="http://schemas.microsoft.com/office/drawing/2015/10/21/chartex" xmlns:cx3="http://schemas.microsoft.com/office/drawing/2016/5/9/chartex" xmlns:cx4="http://schemas.microsoft.com/office/drawing/2016/5/10/chartex" xmlns:cx5="http://schemas.microsoft.com/office/drawing/2016/5/11/chartex" xmlns:cx6="http://schemas.microsoft.com/office/drawing/2016/5/12/chartex" xmlns:cx7="http://schemas.microsoft.com/office/drawing/2016/5/13/chartex" xmlns:cx8="http://schemas.microsoft.com/office/drawing/2016/5/14/chartex" xmlns:mc="http://schemas.openxmlformats.org/markup-compatibility/2006" xmlns:aink="http://schemas.microsoft.com/office/drawing/2016/ink" xmlns:am3d="http://schemas.microsoft.com/office/drawing/2017/model3d" xmlns:o="urn:schemas-microsoft-com:office:office" xmlns:r="http://schemas.openxmlformats.org/officeDocument/2006/relationships" xmlns:m="http://schemas.openxmlformats.org/officeDocument/2006/math" xmlns:v="urn:schemas-microsoft-com:vml" xmlns:wp14="http://schemas.microsoft.com/office/word/2010/wordprocessingDrawing" xmlns:wp="http://schemas.openxmlformats.org/drawingml/2006/wordprocessingDrawing" xmlns:w10="urn:schemas-microsoft-com:office:word" xmlns:w="http://schemas.openxmlformats.org/wordprocessingml/2006/main" xmlns:w14="http://schemas.microsoft.com/office/word/2010/wordml" xmlns:w15="http://schemas.microsoft.com/office/word/2012/wordml" xmlns:w16cex="http://schemas.microsoft.com/office/word/2018/wordml/cex" xmlns:w16cid="http://schemas.microsoft.com/office/word/2016/wordml/cid" xmlns:w16="http://schemas.microsoft.com/office/word/2018/wordml" xmlns:w16sdtdh="http://schemas.microsoft.com/office/word/2020/wordml/sdtdatahash" xmlns:w16se="http://schemas.microsoft.com/office/word/2015/wordml/symex" xmlns:wpg="http://schemas.microsoft.com/office/word/2010/wordprocessingGroup" xmlns:wpi="http://schemas.microsoft.com/office/word/2010/wordprocessingInk" xmlns:wne="http://schemas.microsoft.com/office/word/2006/wordml" xmlns:wps="http://schemas.microsoft.com/office/word/2010/wordprocessingShape" mc:Ignorable="w14 w15 w16se w16cid w16 w16cex w16sdtdh wp14">
   <w:endnote w:type="separator" w:id="-1">
     <w:p>
       <w:pPr>
@@ -514,7 +575,7 @@
 </file>
 
 <file path=word/footnotes.xml><?xml version="1.0" encoding="utf-8"?>
-<w:footnotes xmlns:wpc="http://schemas.microsoft.com/office/word/2010/wordprocessingCanvas" xmlns:cx="http://schemas.microsoft.com/office/drawing/2014/chartex" xmlns:mc="http://schemas.openxmlformats.org/markup-compatibility/2006" xmlns:o="urn:schemas-microsoft-com:office:office" xmlns:r="http://schemas.openxmlformats.org/officeDocument/2006/relationships" xmlns:m="http://schemas.openxmlformats.org/officeDocument/2006/math" xmlns:v="urn:schemas-microsoft-com:vml" xmlns:wp14="http://schemas.microsoft.com/office/word/2010/wordprocessingDrawing" xmlns:wp="http://schemas.openxmlformats.org/drawingml/2006/wordprocessingDrawing" xmlns:w10="urn:schemas-microsoft-com:office:word" xmlns:w="http://schemas.openxmlformats.org/wordprocessingml/2006/main" xmlns:w14="http://schemas.microsoft.com/office/word/2010/wordml" xmlns:w15="http://schemas.microsoft.com/office/word/2012/wordml" xmlns:w16se="http://schemas.microsoft.com/office/word/2015/wordml/symex" xmlns:wpg="http://schemas.microsoft.com/office/word/2010/wordprocessingGroup" xmlns:wpi="http://schemas.microsoft.com/office/word/2010/wordprocessingInk" xmlns:wne="http://schemas.microsoft.com/office/word/2006/wordml" xmlns:wps="http://schemas.microsoft.com/office/word/2010/wordprocessingShape" mc:Ignorable="w14 w15 w16se wp14">
+<w:footnotes xmlns:wpc="http://schemas.microsoft.com/office/word/2010/wordprocessingCanvas" xmlns:cx="http://schemas.microsoft.com/office/drawing/2014/chartex" xmlns:cx1="http://schemas.microsoft.com/office/drawing/2015/9/8/chartex" xmlns:cx2="http://schemas.microsoft.com/office/drawing/2015/10/21/chartex" xmlns:cx3="http://schemas.microsoft.com/office/drawing/2016/5/9/chartex" xmlns:cx4="http://schemas.microsoft.com/office/drawing/2016/5/10/chartex" xmlns:cx5="http://schemas.microsoft.com/office/drawing/2016/5/11/chartex" xmlns:cx6="http://schemas.microsoft.com/office/drawing/2016/5/12/chartex" xmlns:cx7="http://schemas.microsoft.com/office/drawing/2016/5/13/chartex" xmlns:cx8="http://schemas.microsoft.com/office/drawing/2016/5/14/chartex" xmlns:mc="http://schemas.openxmlformats.org/markup-compatibility/2006" xmlns:aink="http://schemas.microsoft.com/office/drawing/2016/ink" xmlns:am3d="http://schemas.microsoft.com/office/drawing/2017/model3d" xmlns:o="urn:schemas-microsoft-com:office:office" xmlns:r="http://schemas.openxmlformats.org/officeDocument/2006/relationships" xmlns:m="http://schemas.openxmlformats.org/officeDocument/2006/math" xmlns:v="urn:schemas-microsoft-com:vml" xmlns:wp14="http://schemas.microsoft.com/office/word/2010/wordprocessingDrawing" xmlns:wp="http://schemas.openxmlformats.org/drawingml/2006/wordprocessingDrawing" xmlns:w10="urn:schemas-microsoft-com:office:word" xmlns:w="http://schemas.openxmlformats.org/wordprocessingml/2006/main" xmlns:w14="http://schemas.microsoft.com/office/word/2010/wordml" xmlns:w15="http://schemas.microsoft.com/office/word/2012/wordml" xmlns:w16cex="http://schemas.microsoft.com/office/word/2018/wordml/cex" xmlns:w16cid="http://schemas.microsoft.com/office/word/2016/wordml/cid" xmlns:w16="http://schemas.microsoft.com/office/word/2018/wordml" xmlns:w16sdtdh="http://schemas.microsoft.com/office/word/2020/wordml/sdtdatahash" xmlns:w16se="http://schemas.microsoft.com/office/word/2015/wordml/symex" xmlns:wpg="http://schemas.microsoft.com/office/word/2010/wordprocessingGroup" xmlns:wpi="http://schemas.microsoft.com/office/word/2010/wordprocessingInk" xmlns:wne="http://schemas.microsoft.com/office/word/2006/wordml" xmlns:wps="http://schemas.microsoft.com/office/word/2010/wordprocessingShape" mc:Ignorable="w14 w15 w16se w16cid w16 w16cex w16sdtdh wp14">
   <w:footnote w:type="separator" w:id="-1">
     <w:p>
       <w:pPr>
@@ -539,7 +600,7 @@
 </file>
 
 <file path=word/styles.xml><?xml version="1.0" encoding="utf-8"?>
-<w:styles xmlns:mc="http://schemas.openxmlformats.org/markup-compatibility/2006" xmlns:r="http://schemas.openxmlformats.org/officeDocument/2006/relationships" xmlns:w="http://schemas.openxmlformats.org/wordprocessingml/2006/main" xmlns:w14="http://schemas.microsoft.com/office/word/2010/wordml" xmlns:w15="http://schemas.microsoft.com/office/word/2012/wordml" xmlns:w16se="http://schemas.microsoft.com/office/word/2015/wordml/symex" mc:Ignorable="w14 w15 w16se">
+<w:styles xmlns:mc="http://schemas.openxmlformats.org/markup-compatibility/2006" xmlns:r="http://schemas.openxmlformats.org/officeDocument/2006/relationships" xmlns:w="http://schemas.openxmlformats.org/wordprocessingml/2006/main" xmlns:w14="http://schemas.microsoft.com/office/word/2010/wordml" xmlns:w15="http://schemas.microsoft.com/office/word/2012/wordml" xmlns:w16cex="http://schemas.microsoft.com/office/word/2018/wordml/cex" xmlns:w16cid="http://schemas.microsoft.com/office/word/2016/wordml/cid" xmlns:w16="http://schemas.microsoft.com/office/word/2018/wordml" xmlns:w16sdtdh="http://schemas.microsoft.com/office/word/2020/wordml/sdtdatahash" xmlns:w16se="http://schemas.microsoft.com/office/word/2015/wordml/symex" mc:Ignorable="w14 w15 w16se w16cid w16 w16cex w16sdtdh">
   <w:docDefaults>
     <w:rPrDefault>
       <w:rPr>
@@ -555,7 +616,7 @@
       </w:pPr>
     </w:pPrDefault>
   </w:docDefaults>
-  <w:latentStyles w:defLockedState="0" w:defUIPriority="99" w:defSemiHidden="0" w:defUnhideWhenUsed="0" w:defQFormat="0" w:count="371">
+  <w:latentStyles w:defLockedState="0" w:defUIPriority="99" w:defSemiHidden="0" w:defUnhideWhenUsed="0" w:defQFormat="0" w:count="376">
     <w:lsdException w:name="Normal" w:uiPriority="0" w:qFormat="1"/>
     <w:lsdException w:name="heading 1" w:uiPriority="9" w:qFormat="1"/>
     <w:lsdException w:name="heading 2" w:semiHidden="1" w:uiPriority="9" w:unhideWhenUsed="1" w:qFormat="1"/>
@@ -927,6 +988,11 @@
     <w:lsdException w:name="List Table 5 Dark Accent 6" w:uiPriority="50"/>
     <w:lsdException w:name="List Table 6 Colorful Accent 6" w:uiPriority="51"/>
     <w:lsdException w:name="List Table 7 Colorful Accent 6" w:uiPriority="52"/>
+    <w:lsdException w:name="Mention" w:semiHidden="1" w:unhideWhenUsed="1"/>
+    <w:lsdException w:name="Smart Hyperlink" w:semiHidden="1" w:unhideWhenUsed="1"/>
+    <w:lsdException w:name="Hashtag" w:semiHidden="1" w:unhideWhenUsed="1"/>
+    <w:lsdException w:name="Unresolved Mention" w:semiHidden="1" w:unhideWhenUsed="1"/>
+    <w:lsdException w:name="Smart Link" w:semiHidden="1" w:unhideWhenUsed="1"/>
   </w:latentStyles>
   <w:style w:type="paragraph" w:default="1" w:styleId="Normal">
     <w:name w:val="Normal"/>

</xml_diff>